<commit_message>
Remove em dashes from the report draft
Rewrites the affected sentences rather than substituting punctuation, so
the prose reads naturally. The only remaining en dash is a numeric range.

Co-Authored-By: Claude Opus 5 <noreply@anthropic.com>
Claude-Session: https://claude.ai/code/session_01E28KNCMg4oxXhPv1b9nDk6
</commit_message>
<xml_diff>
--- a/docs/BMIT3273-Report-Content-Draft.docx
+++ b/docs/BMIT3273-Report-Content-Draft.docx
@@ -45,7 +45,7 @@
           <w:sz w:val="22"/>
           <w:szCs w:val="22"/>
         </w:rPr>
-        <w:t xml:space="preserve">Report content draft — sections 3 to 10</w:t>
+        <w:t xml:space="preserve">Report content draft: sections 3 to 10</w:t>
       </w:r>
     </w:p>
     <w:p>
@@ -81,7 +81,7 @@
         <w:t xml:space="preserve">Everything highlighted in yellow must be replaced with a real value from your own AWS Academy lab account.</w:t>
       </w:r>
       <w:r>
-        <w:t xml:space="preserve"> Every figure reference (F-1, LB-1, SC-2 and so on) must point at a screenshot you actually captured. Text describing a setting you did not configure should be deleted rather than reworded — an unsupported claim costs more marks than an omission, and it is the thing most likely to be exposed during the demonstration session.</w:t>
+        <w:t xml:space="preserve"> Every figure reference (F-1, LB-1, SC-2 and so on) must point at a screenshot you actually captured. Text describing a setting you did not configure should be deleted rather than reworded. An unsupported claim costs more marks than an omission, and it is the thing most likely to be exposed during the demonstration session.</w:t>
       </w:r>
     </w:p>
     <w:p>
@@ -706,7 +706,7 @@
         <w:spacing w:after="160" w:line="276"/>
       </w:pPr>
       <w:r>
-        <w:t xml:space="preserve">This report documents a proof of concept that our group built in the AWS Academy Lab Project – Cloud Web Application Builder environment to address that problem. The deliverable is a working student-records application that supports the four record operations the admissions staff depend on — viewing, adding, modifying and deleting student records — deployed on an architecture that distributes traffic across multiple servers, adds and removes servers automatically as load changes, keeps the database off the public internet, and stores its database credentials outside the application code.</w:t>
+        <w:t xml:space="preserve">This report documents a proof of concept that our group built in the AWS Academy Lab Project - Cloud Web Application Builder environment to address that problem. The deliverable is a working student-records application that supports the four record operations the admissions staff depend on: viewing, adding, modifying and deleting student records. It is deployed on an architecture that distributes traffic across multiple servers, adds and removes servers automatically as load changes, keeps the database off the public internet, and stores its database credentials outside the application code.</w:t>
       </w:r>
     </w:p>
     <w:p>
@@ -872,7 +872,7 @@
         <w:t xml:space="preserve">private application subnets</w:t>
       </w:r>
       <w:r>
-        <w:t xml:space="preserve"> hold the EC2 instances that run the application. These subnets have no route to the internet gateway, so the instances cannot be reached directly from the internet no matter what their security group allows — the only path to them is through the load balancer. </w:t>
+        <w:t xml:space="preserve"> hold the EC2 instances that run the application. These subnets have no route to the internet gateway, so the instances cannot be reached directly from the internet no matter what their security group allows; the only path to them is through the load balancer. </w:t>
       </w:r>
       <w:r>
         <w:rPr>
@@ -919,7 +919,7 @@
           <w:sz w:val="20"/>
           <w:szCs w:val="20"/>
         </w:rPr>
-        <w:t xml:space="preserve">Adjust the paragraphs above to what you actually built. If the lab budget or service restrictions prevented you from running a NAT gateway, you most likely placed the application instances in the public subnets instead. That is a legitimate choice in a cost-constrained proof of concept, and it is far better to explain it honestly than to claim a private tier you did not build. Replacement rationale: "NAT gateway charges accrue hourly regardless of traffic and would have consumed a disproportionate share of the lab budget, so the application instances were placed in the public subnets with their security group restricted to accept traffic only from the load balancer’s security group. This preserves the practical effect of the private tier — no direct inbound access from the internet — at no additional cost, while the database remains in genuinely private subnets." Then make sure your diagram matches.</w:t>
+        <w:t xml:space="preserve">Adjust the paragraphs above to what you actually built. If the lab budget or service restrictions prevented you from running a NAT gateway, you most likely placed the application instances in the public subnets instead. That is a legitimate choice in a cost-constrained proof of concept, and it is far better to explain it honestly than to claim a private tier you did not build. Replacement rationale: "NAT gateway charges accrue hourly regardless of traffic and would have consumed a disproportionate share of the lab budget, so the application instances were placed in the public subnets with their security group restricted to accept traffic only from the load balancer’s security group. This preserves the practical effect of the private tier (no direct inbound access from the internet) at no additional cost, while the database remains in genuinely private subnets." Then make sure your diagram matches.</w:t>
       </w:r>
     </w:p>
     <w:p>
@@ -1018,7 +1018,7 @@
         <w:spacing w:after="160" w:line="276"/>
       </w:pPr>
       <w:r>
-        <w:t xml:space="preserve">We chose Amazon RDS for MySQL over continuing to run MySQL on an EC2 instance. The managed service handles patching, backups and recovery, and it separates the database’s lifecycle from the application servers’ — which is precisely what allows the application tier to be replaced freely by Auto Scaling. Keeping the database on one of the application instances would have made every scaling event a risk to the data.</w:t>
+        <w:t xml:space="preserve">We chose Amazon RDS for MySQL over continuing to run MySQL on an EC2 instance. The managed service handles patching, backups and recovery, and it separates the database’s lifecycle from the application servers’. That separation is precisely what allows the application tier to be replaced freely by Auto Scaling. Keeping the database on one of the application instances would have made every scaling event a risk to the data.</w:t>
       </w:r>
     </w:p>
     <w:p>
@@ -2484,7 +2484,7 @@
         <w:t xml:space="preserve">[2]</w:t>
       </w:r>
       <w:r>
-        <w:t xml:space="preserve"> is set by availability rather than by load. One instance would be sufficient for baseline traffic, but it would also mean that losing a single instance — or a single Availability Zone — takes the application offline until a replacement finishes booting. Two instances in two zones is the smallest configuration that survives that failure, so the second instance is the cost of the availability requirement, not spare capacity.</w:t>
+        <w:t xml:space="preserve"> is set by availability rather than by load. One instance would be sufficient for baseline traffic, but it would also mean that losing a single instance, or a single Availability Zone, takes the application offline until a replacement finishes booting. Two instances in two zones is the smallest configuration that survives that failure, so the second instance is the cost of the availability requirement, not spare capacity.</w:t>
       </w:r>
     </w:p>
     <w:p>
@@ -2561,7 +2561,7 @@
         <w:t xml:space="preserve">[20 GB]</w:t>
       </w:r>
       <w:r>
-        <w:t xml:space="preserve"> — the minimum that comfortably holds the dataset — because RDS storage is billed on what is provisioned, not what is used.</w:t>
+        <w:t xml:space="preserve">, the minimum that comfortably holds the dataset, because RDS storage is billed on what is provisioned rather than on what is used.</w:t>
       </w:r>
     </w:p>
     <w:p>
@@ -3454,7 +3454,7 @@
         <w:t xml:space="preserve">[2]</w:t>
       </w:r>
       <w:r>
-        <w:t xml:space="preserve"> failures. The health check is the mechanism that connects load balancing to availability: the load balancer routes only to targets currently passing it, so an instance that fails — whether through an application error or the loss of its Availability Zone — is removed from rotation automatically, without a person intervening (Amazon Web Services, n.d.-c).</w:t>
+        <w:t xml:space="preserve"> failures. The health check is the mechanism that connects load balancing to availability: the load balancer routes only to targets currently passing it, so an instance that fails, whether through an application error or the loss of its Availability Zone, is removed from rotation automatically, without a person intervening (Amazon Web Services, n.d.-c).</w:t>
       </w:r>
     </w:p>
     <w:p>
@@ -3485,7 +3485,7 @@
           <w:highlight w:val="yellow"/>
           <w:highlightCs w:val="yellow"/>
         </w:rPr>
-        <w:t xml:space="preserve">[state how you confirmed it — for example, the CloudWatch NetworkIn or CPUUtilization metric rose on both instances simultaneously, or the per-instance request count in the target group metrics showed comparable volumes]</w:t>
+        <w:t xml:space="preserve">[state how you confirmed it; for example, the CloudWatch NetworkIn or CPUUtilization metric rose on both instances simultaneously, or the per-instance request count in the target group metrics showed comparable volumes]</w:t>
       </w:r>
       <w:r>
         <w:t xml:space="preserve">.</w:t>
@@ -3799,7 +3799,7 @@
           <w:sz w:val="20"/>
           <w:szCs w:val="20"/>
         </w:rPr>
-        <w:t xml:space="preserve">On scale-in evidence: scale-in is deliberately slower than scale-out, so you may need to leave the environment idle for 10–15 minutes after the load test to capture it. If you could not observe it within the session, say so explicitly rather than implying you did — the rubric says "where available".</w:t>
+        <w:t xml:space="preserve">On scale-in evidence: scale-in is deliberately slower than scale-out, so you may need to leave the environment idle for 10–15 minutes after the load test to capture it. If you could not observe it within the session, say so explicitly rather than implying you did. The rubric says "where available".</w:t>
       </w:r>
     </w:p>
     <w:p>
@@ -3865,7 +3865,7 @@
         <w:t xml:space="preserve">Decoupled data tier.</w:t>
       </w:r>
       <w:r>
-        <w:t xml:space="preserve"> Moving the database out of the application instance and into RDS is what makes the application tier disposable. Any instance can be terminated at any time — by a scaling event, an instance failure or a deployment — without data loss, because no instance owns any data.</w:t>
+        <w:t xml:space="preserve"> Moving the database out of the application instance and into RDS is what makes the application tier disposable. Any instance can be terminated at any time by a scaling event, an instance failure or a deployment, and no data is lost, because no instance owns any data.</w:t>
       </w:r>
     </w:p>
     <w:p>
@@ -4442,7 +4442,7 @@
         <w:t xml:space="preserve">[app-sg]</w:t>
       </w:r>
       <w:r>
-        <w:t xml:space="preserve"> as its source applies automatically to every instance the Auto Scaling group launches, and to no other resource — so the rule stays correct as the fleet changes size, and it cannot be widened accidentally by an IP address being reused.</w:t>
+        <w:t xml:space="preserve"> as its source applies automatically to every instance the Auto Scaling group launches, and to no other resource. The rule therefore stays correct as the fleet changes size, and it cannot be widened accidentally by an IP address being reused.</w:t>
       </w:r>
     </w:p>
     <w:p>
@@ -4480,7 +4480,7 @@
           <w:highlight w:val="yellow"/>
           <w:highlightCs w:val="yellow"/>
         </w:rPr>
-        <w:t xml:space="preserve">[state how — for example, attempting a connection to the RDS endpoint from outside the VPC and observing that it fails, while the same connection from an application instance succeeds]</w:t>
+        <w:t xml:space="preserve">[state how; for example, attempting a connection to the RDS endpoint from outside the VPC and observing that it fails, while the same connection from an application instance succeeds]</w:t>
       </w:r>
       <w:r>
         <w:t xml:space="preserve">. The network placement and the security group are independent controls, and the database is protected by both.</w:t>
@@ -4549,7 +4549,7 @@
           <w:highlight w:val="yellow"/>
           <w:highlightCs w:val="yellow"/>
         </w:rPr>
-        <w:t xml:space="preserve">[Describe your actual arrangement — for example, port 22 is not open to 0.0.0.0/0 on any security group, and administrative sessions originate from the Cloud9 environment inside the VPC.]</w:t>
+        <w:t xml:space="preserve">[Describe your actual arrangement; for example, port 22 is not open to 0.0.0.0/0 on any security group, and administrative sessions originate from the Cloud9 environment inside the VPC.]</w:t>
       </w:r>
     </w:p>
     <w:p>
@@ -4664,7 +4664,7 @@
           <w:highlight w:val="yellow"/>
           <w:highlightCs w:val="yellow"/>
         </w:rPr>
-        <w:t xml:space="preserve">[State the command and its parameters — concurrency, request rate and duration.]</w:t>
+        <w:t xml:space="preserve">[State the command and its parameters: concurrency, request rate and duration.]</w:t>
       </w:r>
       <w:r>
         <w:t xml:space="preserve"> Metrics were collected from </w:t>
@@ -5414,7 +5414,7 @@
           <w:highlight w:val="yellow"/>
           <w:highlightCs w:val="yellow"/>
         </w:rPr>
-        <w:t xml:space="preserve">[Write this once you have your numbers. The pattern to describe, if your results show it: response times stay flat at normal load; as the request rate rises past what two instances can serve, response times increase and CPU utilisation crosses the scaling target; the Auto Scaling group adds instances; once those instances pass their health checks and start receiving traffic, response times fall back toward the baseline. The delay between the load increasing and capacity arriving is the interesting part — quantify it, because it is a real property of the system, and knowing it is what distinguishes analysis from a screenshot.]</w:t>
+        <w:t xml:space="preserve">[Write this once you have your numbers. The pattern to describe, if your results show it: response times stay flat at normal load; as the request rate rises past what two instances can serve, response times increase and CPU utilisation crosses the scaling target; the Auto Scaling group adds instances; once those instances pass their health checks and start receiving traffic, response times fall back toward the baseline. The delay between the load increasing and capacity arriving is the interesting part, so quantify it. It is a real property of the system, and knowing it is what distinguishes analysis from a screenshot.]</w:t>
       </w:r>
     </w:p>
     <w:p>
@@ -5433,7 +5433,7 @@
           <w:sz w:val="20"/>
           <w:szCs w:val="20"/>
         </w:rPr>
-        <w:t xml:space="preserve">If you recorded errors or timeouts, report them and explain when they occurred — typically in the window between demand rising and new capacity becoming healthy. Reporting a clean run you did not have is both an academic integrity problem and easy to expose in questioning.</w:t>
+        <w:t xml:space="preserve">If you recorded errors or timeouts, report them and explain when they occurred, typically in the window between demand rising and new capacity becoming healthy. Reporting a clean run you did not have is both an academic integrity problem and easy to expose in questioning.</w:t>
       </w:r>
     </w:p>
     <w:p>
@@ -5461,7 +5461,7 @@
           <w:sz w:val="20"/>
           <w:szCs w:val="20"/>
         </w:rPr>
-        <w:t xml:space="preserve">Complete this from your group’s actual division of work — label it DEMO-1.</w:t>
+        <w:t xml:space="preserve">Complete this from your group’s actual division of work, and label it DEMO-1.</w:t>
       </w:r>
     </w:p>
     <w:tbl>
@@ -6196,7 +6196,7 @@
         <w:t xml:space="preserve">transport encryption and authentication</w:t>
       </w:r>
       <w:r>
-        <w:t xml:space="preserve">: a certificate from AWS Certificate Manager with an HTTPS listener would protect data in transit, and access control would restrict the application to authenticated staff rather than the whole internet — a necessity for personal data regardless of the technical architecture. The third is </w:t>
+        <w:t xml:space="preserve">: a certificate from AWS Certificate Manager with an HTTPS listener would protect data in transit, and access control would restrict the application to authenticated staff rather than the whole internet, which is a necessity for personal data regardless of the technical architecture. The third is </w:t>
       </w:r>
       <w:r>
         <w:rPr>
@@ -6251,7 +6251,7 @@
           <w:sz w:val="20"/>
           <w:szCs w:val="20"/>
         </w:rPr>
-        <w:t xml:space="preserve">Verify every URL before submitting, and check which APA edition your faculty requires — the 7th edition does not require retrieval dates for stable content. Add any AWS Academy lab guides or textbooks you actually drew on, and delete any entry below that you did not use.</w:t>
+        <w:t xml:space="preserve">Verify every URL before submitting, and check which APA edition your faculty requires, since the 7th edition does not require retrieval dates for stable content. Add any AWS Academy lab guides or textbooks you actually drew on, and delete any entry below that you did not use.</w:t>
       </w:r>
     </w:p>
     <w:p>
@@ -6354,7 +6354,7 @@
           <w:b/>
           <w:bCs/>
         </w:rPr>
-        <w:t xml:space="preserve">10.  Appendices — evidence checklist</w:t>
+        <w:t xml:space="preserve">10.  Appendices: evidence checklist</w:t>
       </w:r>
     </w:p>
     <w:p>

</xml_diff>